<commit_message>
Atualiza fluxos do departamento pessoal e inclui obrigações fiscais
</commit_message>
<xml_diff>
--- a/3 - Departamento Pessoal/3 - Fluxo de folha de pagamento/1 - Documentação/Procedineto de folha automatica.docx
+++ b/3 - Departamento Pessoal/3 - Fluxo de folha de pagamento/1 - Documentação/Procedineto de folha automatica.docx
@@ -937,11 +937,22 @@
       <w:r>
         <w:rPr>
           <w:rFonts w:asciiTheme="majorHAnsi" w:eastAsia="Times New Roman" w:hAnsiTheme="majorHAnsi" w:cstheme="majorHAnsi"/>
-          <w:sz w:val="24"/>
-          <w:szCs w:val="24"/>
-          <w:lang w:eastAsia="pt-BR"/>
-        </w:rPr>
-        <w:t>O processo inicia no começo de cada competência, quando o Departamento Pessoal organiza as rotinas mensais de folha.</w:t>
+          <w:color w:val="000000" w:themeColor="text1"/>
+          <w:sz w:val="24"/>
+          <w:szCs w:val="24"/>
+          <w:highlight w:val="yellow"/>
+          <w:lang w:eastAsia="pt-BR"/>
+        </w:rPr>
+        <w:t>O processo inicia no começo de cada competência</w:t>
+      </w:r>
+      <w:r>
+        <w:rPr>
+          <w:rFonts w:asciiTheme="majorHAnsi" w:eastAsia="Times New Roman" w:hAnsiTheme="majorHAnsi" w:cstheme="majorHAnsi"/>
+          <w:sz w:val="24"/>
+          <w:szCs w:val="24"/>
+          <w:lang w:eastAsia="pt-BR"/>
+        </w:rPr>
+        <w:t>, quando o Departamento Pessoal organiza as rotinas mensais de folha.</w:t>
       </w:r>
     </w:p>
     <w:p>

</xml_diff>